<commit_message>
Update Praktikum 5 project and report
</commit_message>
<xml_diff>
--- a/Praktikum 5/Laporan Praktikum 5 AppMob_Iqbal Miftahul Fikri_2411531004.docx
+++ b/Praktikum 5/Laporan Praktikum 5 AppMob_Iqbal Miftahul Fikri_2411531004.docx
@@ -1168,65 +1168,6 @@
     </w:p>
     <w:p>
       <w:pPr>
-        <w:pStyle w:val="ListParagraph"/>
-        <w:ind w:left="1080"/>
-        <w:rPr>
-          <w:rFonts w:ascii="Times New Roman" w:hAnsi="Times New Roman" w:cs="Times New Roman"/>
-          <w:lang w:val="sv-SE"/>
-        </w:rPr>
-      </w:pPr>
-    </w:p>
-    <w:p>
-      <w:pPr>
-        <w:pStyle w:val="ListParagraph"/>
-        <w:numPr>
-          <w:ilvl w:val="0"/>
-          <w:numId w:val="2"/>
-        </w:numPr>
-        <w:rPr>
-          <w:rFonts w:ascii="Times New Roman" w:hAnsi="Times New Roman" w:cs="Times New Roman"/>
-          <w:lang w:val="sv-SE"/>
-        </w:rPr>
-      </w:pPr>
-      <w:r>
-        <w:rPr>
-          <w:rFonts w:ascii="Times New Roman" w:hAnsi="Times New Roman" w:cs="Times New Roman"/>
-          <w:lang w:val="sv-SE"/>
-        </w:rPr>
-        <w:t>Hasil Akhir : Aplikasi Finansial Lengkap</w:t>
-      </w:r>
-    </w:p>
-    <w:p>
-      <w:pPr>
-        <w:pStyle w:val="ListParagraph"/>
-        <w:ind w:left="1080"/>
-        <w:rPr>
-          <w:rFonts w:ascii="Times New Roman" w:hAnsi="Times New Roman" w:cs="Times New Roman"/>
-          <w:lang w:val="sv-SE"/>
-        </w:rPr>
-      </w:pPr>
-    </w:p>
-    <w:p>
-      <w:pPr>
-        <w:pStyle w:val="ListParagraph"/>
-        <w:ind w:left="1080"/>
-        <w:rPr>
-          <w:rFonts w:ascii="Times New Roman" w:hAnsi="Times New Roman" w:cs="Times New Roman"/>
-          <w:lang w:val="sv-SE"/>
-        </w:rPr>
-      </w:pPr>
-      <w:r>
-        <w:rPr>
-          <w:rFonts w:ascii="Times New Roman" w:hAnsi="Times New Roman" w:cs="Times New Roman"/>
-          <w:lang w:val="sv-SE"/>
-        </w:rPr>
-        <w:t>Setelah selesai seluruh kode, maka akan tampil output seperti ini.</w:t>
-      </w:r>
-    </w:p>
-    <w:p>
-      <w:pPr>
-        <w:pStyle w:val="ListParagraph"/>
-        <w:ind w:left="1080"/>
         <w:rPr>
           <w:rFonts w:ascii="Times New Roman" w:hAnsi="Times New Roman" w:cs="Times New Roman"/>
           <w:lang w:val="sv-SE"/>
@@ -2051,22 +1992,22 @@
         <w:ind w:left="1080"/>
         <w:rPr>
           <w:rFonts w:ascii="Times New Roman" w:hAnsi="Times New Roman" w:cs="Times New Roman"/>
-          <w:lang w:val="sv-SE"/>
-        </w:rPr>
-      </w:pPr>
-    </w:p>
-    <w:p>
-      <w:pPr>
-        <w:pStyle w:val="ListParagraph"/>
-        <w:ind w:left="1080"/>
-        <w:rPr>
-          <w:rFonts w:ascii="Times New Roman" w:hAnsi="Times New Roman" w:cs="Times New Roman"/>
-          <w:lang w:val="sv-SE"/>
-        </w:rPr>
-      </w:pPr>
-      <w:r>
-        <w:rPr>
-          <w:rFonts w:ascii="Times New Roman" w:hAnsi="Times New Roman" w:cs="Times New Roman"/>
+        </w:rPr>
+      </w:pPr>
+    </w:p>
+    <w:p>
+      <w:pPr>
+        <w:pStyle w:val="ListParagraph"/>
+        <w:ind w:left="1080"/>
+        <w:rPr>
+          <w:rFonts w:ascii="Times New Roman" w:hAnsi="Times New Roman" w:cs="Times New Roman"/>
+          <w:lang w:val="sv-SE"/>
+        </w:rPr>
+      </w:pPr>
+      <w:r>
+        <w:rPr>
+          <w:rFonts w:ascii="Times New Roman" w:hAnsi="Times New Roman" w:cs="Times New Roman"/>
+          <w:noProof/>
           <w:lang w:val="sv-SE"/>
         </w:rPr>
         <w:drawing>
@@ -2183,6 +2124,7 @@
       <w:r>
         <w:rPr>
           <w:rFonts w:ascii="Times New Roman" w:hAnsi="Times New Roman" w:cs="Times New Roman"/>
+          <w:noProof/>
           <w:lang w:val="sv-SE"/>
         </w:rPr>
         <w:drawing>
@@ -2349,6 +2291,7 @@
       <w:r>
         <w:rPr>
           <w:rFonts w:ascii="Times New Roman" w:hAnsi="Times New Roman" w:cs="Times New Roman"/>
+          <w:noProof/>
         </w:rPr>
         <w:drawing>
           <wp:inline distT="0" distB="0" distL="0" distR="0" wp14:anchorId="7E5C6440" wp14:editId="69A9957E">
@@ -2549,6 +2492,7 @@
       <w:r>
         <w:rPr>
           <w:rFonts w:ascii="Times New Roman" w:hAnsi="Times New Roman" w:cs="Times New Roman"/>
+          <w:noProof/>
         </w:rPr>
         <w:drawing>
           <wp:inline distT="0" distB="0" distL="0" distR="0" wp14:anchorId="24C3A383" wp14:editId="64679B6B">
@@ -2654,6 +2598,7 @@
       <w:r>
         <w:rPr>
           <w:rFonts w:ascii="Times New Roman" w:hAnsi="Times New Roman" w:cs="Times New Roman"/>
+          <w:noProof/>
         </w:rPr>
         <w:lastRenderedPageBreak/>
         <w:drawing>
@@ -2762,6 +2707,7 @@
       <w:r>
         <w:rPr>
           <w:rFonts w:ascii="Times New Roman" w:hAnsi="Times New Roman" w:cs="Times New Roman"/>
+          <w:noProof/>
         </w:rPr>
         <w:drawing>
           <wp:inline distT="0" distB="0" distL="0" distR="0" wp14:anchorId="03A3C015" wp14:editId="544E060C">
@@ -2911,6 +2857,7 @@
       <w:r>
         <w:rPr>
           <w:rFonts w:ascii="Times New Roman" w:hAnsi="Times New Roman" w:cs="Times New Roman"/>
+          <w:noProof/>
         </w:rPr>
         <w:lastRenderedPageBreak/>
         <w:drawing>
@@ -2978,6 +2925,7 @@
         <w:ind w:left="1080"/>
         <w:rPr>
           <w:rFonts w:ascii="Times New Roman" w:hAnsi="Times New Roman" w:cs="Times New Roman"/>
+          <w:lang w:val="sv-SE"/>
         </w:rPr>
       </w:pPr>
       <w:r>
@@ -3010,15 +2958,23 @@
         <w:rPr>
           <w:rFonts w:ascii="Times New Roman" w:hAnsi="Times New Roman" w:cs="Times New Roman"/>
         </w:rPr>
-        <w:t xml:space="preserve"> digunakan untuk membuka database dan membuat tabel apabila database belum tersedia. Properti initialRoute menentukan bahwa aplikasi pertama kali menampilkan halaman login, sedangkan routes digunakan untuk mengatur navigasi menuju halaman tertentu.</w:t>
-      </w:r>
-    </w:p>
-    <w:p>
-      <w:pPr>
-        <w:pStyle w:val="ListParagraph"/>
-        <w:ind w:left="1080"/>
-        <w:rPr>
-          <w:rFonts w:ascii="Times New Roman" w:hAnsi="Times New Roman" w:cs="Times New Roman"/>
+        <w:t xml:space="preserve"> digunakan untuk membuka database dan membuat tabel apabila database belum tersedia. </w:t>
+      </w:r>
+      <w:r>
+        <w:rPr>
+          <w:rFonts w:ascii="Times New Roman" w:hAnsi="Times New Roman" w:cs="Times New Roman"/>
+          <w:lang w:val="sv-SE"/>
+        </w:rPr>
+        <w:t>Properti initialRoute menentukan bahwa aplikasi pertama kali menampilkan halaman login, sedangkan routes digunakan untuk mengatur navigasi menuju halaman tertentu.</w:t>
+      </w:r>
+    </w:p>
+    <w:p>
+      <w:pPr>
+        <w:pStyle w:val="ListParagraph"/>
+        <w:ind w:left="1080"/>
+        <w:rPr>
+          <w:rFonts w:ascii="Times New Roman" w:hAnsi="Times New Roman" w:cs="Times New Roman"/>
+          <w:lang w:val="sv-SE"/>
         </w:rPr>
       </w:pPr>
     </w:p>
@@ -3102,45 +3058,36 @@
         <w:ind w:left="1080"/>
         <w:rPr>
           <w:rFonts w:ascii="Times New Roman" w:hAnsi="Times New Roman" w:cs="Times New Roman"/>
-          <w:lang w:val="sv-SE"/>
-        </w:rPr>
-      </w:pPr>
-      <w:r>
-        <w:rPr>
-          <w:rFonts w:ascii="Times New Roman" w:hAnsi="Times New Roman" w:cs="Times New Roman"/>
-          <w:lang w:val="sv-SE"/>
-        </w:rPr>
-        <w:t>Contoh bagian inti proses registrasi</w:t>
-      </w:r>
-      <w:r>
-        <w:rPr>
-          <w:rFonts w:ascii="Times New Roman" w:hAnsi="Times New Roman" w:cs="Times New Roman"/>
-          <w:lang w:val="sv-SE"/>
-        </w:rPr>
-        <w:t>:</w:t>
-      </w:r>
-    </w:p>
-    <w:p>
-      <w:pPr>
-        <w:pStyle w:val="ListParagraph"/>
-        <w:ind w:left="1080"/>
-        <w:rPr>
-          <w:rFonts w:ascii="Times New Roman" w:hAnsi="Times New Roman" w:cs="Times New Roman"/>
-          <w:lang w:val="sv-SE"/>
-        </w:rPr>
-      </w:pPr>
-    </w:p>
-    <w:p>
-      <w:pPr>
-        <w:pStyle w:val="ListParagraph"/>
-        <w:ind w:left="1080"/>
-        <w:rPr>
-          <w:rFonts w:ascii="Times New Roman" w:hAnsi="Times New Roman" w:cs="Times New Roman"/>
-        </w:rPr>
-      </w:pPr>
-      <w:r>
-        <w:rPr>
-          <w:rFonts w:ascii="Times New Roman" w:hAnsi="Times New Roman" w:cs="Times New Roman"/>
+        </w:rPr>
+      </w:pPr>
+      <w:r>
+        <w:rPr>
+          <w:rFonts w:ascii="Times New Roman" w:hAnsi="Times New Roman" w:cs="Times New Roman"/>
+        </w:rPr>
+        <w:t>Contoh bagian inti proses registrasi:</w:t>
+      </w:r>
+    </w:p>
+    <w:p>
+      <w:pPr>
+        <w:pStyle w:val="ListParagraph"/>
+        <w:ind w:left="1080"/>
+        <w:rPr>
+          <w:rFonts w:ascii="Times New Roman" w:hAnsi="Times New Roman" w:cs="Times New Roman"/>
+        </w:rPr>
+      </w:pPr>
+    </w:p>
+    <w:p>
+      <w:pPr>
+        <w:pStyle w:val="ListParagraph"/>
+        <w:ind w:left="1080"/>
+        <w:rPr>
+          <w:rFonts w:ascii="Times New Roman" w:hAnsi="Times New Roman" w:cs="Times New Roman"/>
+        </w:rPr>
+      </w:pPr>
+      <w:r>
+        <w:rPr>
+          <w:rFonts w:ascii="Times New Roman" w:hAnsi="Times New Roman" w:cs="Times New Roman"/>
+          <w:noProof/>
         </w:rPr>
         <w:lastRenderedPageBreak/>
         <w:drawing>
@@ -3356,6 +3303,7 @@
       <w:r>
         <w:rPr>
           <w:rFonts w:ascii="Times New Roman" w:hAnsi="Times New Roman" w:cs="Times New Roman"/>
+          <w:noProof/>
         </w:rPr>
         <w:lastRenderedPageBreak/>
         <w:drawing>
@@ -3520,6 +3468,7 @@
       <w:r>
         <w:rPr>
           <w:rFonts w:ascii="Times New Roman" w:hAnsi="Times New Roman" w:cs="Times New Roman"/>
+          <w:noProof/>
         </w:rPr>
         <w:lastRenderedPageBreak/>
         <w:drawing>
@@ -3746,6 +3695,7 @@
       <w:r>
         <w:rPr>
           <w:rFonts w:ascii="Times New Roman" w:hAnsi="Times New Roman" w:cs="Times New Roman"/>
+          <w:noProof/>
         </w:rPr>
         <w:lastRenderedPageBreak/>
         <w:drawing>
@@ -4006,6 +3956,7 @@
       <w:r>
         <w:rPr>
           <w:rFonts w:ascii="Times New Roman" w:hAnsi="Times New Roman" w:cs="Times New Roman"/>
+          <w:noProof/>
           <w:lang w:val="sv-SE"/>
         </w:rPr>
         <w:drawing>
@@ -4057,6 +4008,7 @@
       <w:r>
         <w:rPr>
           <w:rFonts w:ascii="Times New Roman" w:hAnsi="Times New Roman" w:cs="Times New Roman"/>
+          <w:noProof/>
           <w:lang w:val="sv-SE"/>
         </w:rPr>
         <w:lastRenderedPageBreak/>
@@ -4109,6 +4061,7 @@
       <w:r>
         <w:rPr>
           <w:rFonts w:ascii="Times New Roman" w:hAnsi="Times New Roman" w:cs="Times New Roman"/>
+          <w:noProof/>
           <w:lang w:val="sv-SE"/>
         </w:rPr>
         <w:drawing>
@@ -4215,28 +4168,25 @@
         <w:ind w:left="1080"/>
         <w:rPr>
           <w:rFonts w:ascii="Times New Roman" w:hAnsi="Times New Roman" w:cs="Times New Roman"/>
-        </w:rPr>
-      </w:pPr>
-      <w:r>
-        <w:rPr>
-          <w:rFonts w:ascii="Times New Roman" w:hAnsi="Times New Roman" w:cs="Times New Roman"/>
+          <w:lang w:val="sv-SE"/>
+        </w:rPr>
+      </w:pPr>
+      <w:r>
+        <w:rPr>
+          <w:rFonts w:ascii="Times New Roman" w:hAnsi="Times New Roman" w:cs="Times New Roman"/>
+          <w:lang w:val="sv-SE"/>
         </w:rPr>
         <w:lastRenderedPageBreak/>
-        <w:t>Proses Penyimpanan Transaksi ke SQLite</w:t>
-      </w:r>
-      <w:r>
-        <w:rPr>
-          <w:rFonts w:ascii="Times New Roman" w:hAnsi="Times New Roman" w:cs="Times New Roman"/>
-        </w:rPr>
-        <w:t>:</w:t>
-      </w:r>
-    </w:p>
-    <w:p>
-      <w:pPr>
-        <w:pStyle w:val="ListParagraph"/>
-        <w:ind w:left="1080"/>
-        <w:rPr>
-          <w:rFonts w:ascii="Times New Roman" w:hAnsi="Times New Roman" w:cs="Times New Roman"/>
+        <w:t>Proses Penyimpanan Transaksi ke SQLite:</w:t>
+      </w:r>
+    </w:p>
+    <w:p>
+      <w:pPr>
+        <w:pStyle w:val="ListParagraph"/>
+        <w:ind w:left="1080"/>
+        <w:rPr>
+          <w:rFonts w:ascii="Times New Roman" w:hAnsi="Times New Roman" w:cs="Times New Roman"/>
+          <w:lang w:val="sv-SE"/>
         </w:rPr>
       </w:pPr>
     </w:p>
@@ -4292,6 +4242,7 @@
       <w:r>
         <w:rPr>
           <w:rFonts w:ascii="Times New Roman" w:hAnsi="Times New Roman" w:cs="Times New Roman"/>
+          <w:noProof/>
         </w:rPr>
         <w:drawing>
           <wp:inline distT="0" distB="0" distL="0" distR="0" wp14:anchorId="5291C0AC" wp14:editId="255E737C">
@@ -4502,6 +4453,7 @@
       <w:r>
         <w:rPr>
           <w:rFonts w:ascii="Times New Roman" w:hAnsi="Times New Roman" w:cs="Times New Roman"/>
+          <w:noProof/>
         </w:rPr>
         <w:lastRenderedPageBreak/>
         <w:drawing>
@@ -4673,6 +4625,7 @@
       <w:r>
         <w:rPr>
           <w:rFonts w:ascii="Times New Roman" w:hAnsi="Times New Roman" w:cs="Times New Roman"/>
+          <w:noProof/>
         </w:rPr>
         <w:lastRenderedPageBreak/>
         <w:drawing>
@@ -4892,6 +4845,7 @@
       <w:r>
         <w:rPr>
           <w:rFonts w:ascii="Times New Roman" w:hAnsi="Times New Roman" w:cs="Times New Roman"/>
+          <w:noProof/>
         </w:rPr>
         <w:drawing>
           <wp:inline distT="0" distB="0" distL="0" distR="0" wp14:anchorId="3BAF34C9" wp14:editId="5F551100">
@@ -5092,6 +5046,7 @@
       <w:r>
         <w:rPr>
           <w:rFonts w:ascii="Times New Roman" w:hAnsi="Times New Roman" w:cs="Times New Roman"/>
+          <w:noProof/>
         </w:rPr>
         <w:drawing>
           <wp:inline distT="0" distB="0" distL="0" distR="0" wp14:anchorId="79C07838" wp14:editId="684CA4A4">
@@ -5317,6 +5272,7 @@
       <w:r>
         <w:rPr>
           <w:rFonts w:ascii="Times New Roman" w:hAnsi="Times New Roman" w:cs="Times New Roman"/>
+          <w:noProof/>
           <w:lang w:val="sv-SE"/>
         </w:rPr>
         <w:drawing>
@@ -5435,6 +5391,7 @@
       <w:r>
         <w:rPr>
           <w:rFonts w:ascii="Times New Roman" w:hAnsi="Times New Roman" w:cs="Times New Roman"/>
+          <w:noProof/>
           <w:lang w:val="sv-SE"/>
         </w:rPr>
         <w:drawing>
@@ -5486,6 +5443,7 @@
       <w:r>
         <w:rPr>
           <w:rFonts w:ascii="Times New Roman" w:hAnsi="Times New Roman" w:cs="Times New Roman"/>
+          <w:noProof/>
           <w:lang w:val="sv-SE"/>
         </w:rPr>
         <w:lastRenderedPageBreak/>
@@ -5538,6 +5496,7 @@
       <w:r>
         <w:rPr>
           <w:rFonts w:ascii="Times New Roman" w:hAnsi="Times New Roman" w:cs="Times New Roman"/>
+          <w:noProof/>
           <w:lang w:val="sv-SE"/>
         </w:rPr>
         <w:lastRenderedPageBreak/>
@@ -5590,6 +5549,7 @@
       <w:r>
         <w:rPr>
           <w:rFonts w:ascii="Times New Roman" w:hAnsi="Times New Roman" w:cs="Times New Roman"/>
+          <w:noProof/>
           <w:lang w:val="sv-SE"/>
         </w:rPr>
         <w:lastRenderedPageBreak/>
@@ -5642,6 +5602,7 @@
       <w:r>
         <w:rPr>
           <w:rFonts w:ascii="Times New Roman" w:hAnsi="Times New Roman" w:cs="Times New Roman"/>
+          <w:noProof/>
           <w:lang w:val="sv-SE"/>
         </w:rPr>
         <w:drawing>
@@ -5693,6 +5654,7 @@
       <w:r>
         <w:rPr>
           <w:rFonts w:ascii="Times New Roman" w:hAnsi="Times New Roman" w:cs="Times New Roman"/>
+          <w:noProof/>
           <w:lang w:val="sv-SE"/>
         </w:rPr>
         <w:lastRenderedPageBreak/>
@@ -5745,6 +5707,7 @@
       <w:r>
         <w:rPr>
           <w:rFonts w:ascii="Times New Roman" w:hAnsi="Times New Roman" w:cs="Times New Roman"/>
+          <w:noProof/>
           <w:lang w:val="sv-SE"/>
         </w:rPr>
         <w:lastRenderedPageBreak/>
@@ -5797,6 +5760,7 @@
       <w:r>
         <w:rPr>
           <w:rFonts w:ascii="Times New Roman" w:hAnsi="Times New Roman" w:cs="Times New Roman"/>
+          <w:noProof/>
           <w:lang w:val="sv-SE"/>
         </w:rPr>
         <w:lastRenderedPageBreak/>
@@ -5849,6 +5813,7 @@
       <w:r>
         <w:rPr>
           <w:rFonts w:ascii="Times New Roman" w:hAnsi="Times New Roman" w:cs="Times New Roman"/>
+          <w:noProof/>
           <w:lang w:val="sv-SE"/>
         </w:rPr>
         <w:drawing>
@@ -5900,6 +5865,7 @@
       <w:r>
         <w:rPr>
           <w:rFonts w:ascii="Times New Roman" w:hAnsi="Times New Roman" w:cs="Times New Roman"/>
+          <w:noProof/>
           <w:lang w:val="sv-SE"/>
         </w:rPr>
         <w:lastRenderedPageBreak/>
@@ -7193,6 +7159,7 @@
   <w:style w:type="character" w:default="1" w:styleId="DefaultParagraphFont">
     <w:name w:val="Default Paragraph Font"/>
     <w:uiPriority w:val="1"/>
+    <w:semiHidden/>
     <w:unhideWhenUsed/>
   </w:style>
   <w:style w:type="table" w:default="1" w:styleId="TableNormal">

</xml_diff>

<commit_message>
Update Laporan Praktikum 5
</commit_message>
<xml_diff>
--- a/Praktikum 5/Laporan Praktikum 5 AppMob_Iqbal Miftahul Fikri_2411531004.docx
+++ b/Praktikum 5/Laporan Praktikum 5 AppMob_Iqbal Miftahul Fikri_2411531004.docx
@@ -1168,6 +1168,98 @@
     </w:p>
     <w:p>
       <w:pPr>
+        <w:pStyle w:val="ListParagraph"/>
+        <w:ind w:left="1080"/>
+        <w:rPr>
+          <w:rFonts w:ascii="Times New Roman" w:hAnsi="Times New Roman" w:cs="Times New Roman"/>
+          <w:lang w:val="sv-SE"/>
+        </w:rPr>
+      </w:pPr>
+    </w:p>
+    <w:p>
+      <w:pPr>
+        <w:pStyle w:val="ListParagraph"/>
+        <w:numPr>
+          <w:ilvl w:val="0"/>
+          <w:numId w:val="2"/>
+        </w:numPr>
+        <w:rPr>
+          <w:rFonts w:ascii="Times New Roman" w:hAnsi="Times New Roman" w:cs="Times New Roman"/>
+          <w:lang w:val="sv-SE"/>
+        </w:rPr>
+      </w:pPr>
+      <w:r>
+        <w:rPr>
+          <w:rFonts w:ascii="Times New Roman" w:hAnsi="Times New Roman" w:cs="Times New Roman"/>
+          <w:lang w:val="sv-SE"/>
+        </w:rPr>
+        <w:t>Jika sudah selesai, maka akan tampil output seperti ini</w:t>
+      </w:r>
+    </w:p>
+    <w:p>
+      <w:pPr>
+        <w:pStyle w:val="ListParagraph"/>
+        <w:ind w:left="1080"/>
+        <w:rPr>
+          <w:rFonts w:ascii="Times New Roman" w:hAnsi="Times New Roman" w:cs="Times New Roman"/>
+          <w:lang w:val="sv-SE"/>
+        </w:rPr>
+      </w:pPr>
+    </w:p>
+    <w:p>
+      <w:pPr>
+        <w:pStyle w:val="ListParagraph"/>
+        <w:ind w:left="1080"/>
+        <w:rPr>
+          <w:rFonts w:ascii="Times New Roman" w:hAnsi="Times New Roman" w:cs="Times New Roman"/>
+          <w:lang w:val="sv-SE"/>
+        </w:rPr>
+      </w:pPr>
+      <w:r>
+        <w:rPr>
+          <w:rFonts w:ascii="Times New Roman" w:hAnsi="Times New Roman" w:cs="Times New Roman"/>
+          <w:lang w:val="sv-SE"/>
+        </w:rPr>
+        <w:lastRenderedPageBreak/>
+        <w:drawing>
+          <wp:inline distT="0" distB="0" distL="0" distR="0" wp14:anchorId="01BAEC76" wp14:editId="0D48FCBD">
+            <wp:extent cx="2566846" cy="4328160"/>
+            <wp:effectExtent l="0" t="0" r="5080" b="0"/>
+            <wp:docPr id="1208613396" name="Picture 1"/>
+            <wp:cNvGraphicFramePr>
+              <a:graphicFrameLocks xmlns:a="http://schemas.openxmlformats.org/drawingml/2006/main" noChangeAspect="1"/>
+            </wp:cNvGraphicFramePr>
+            <a:graphic xmlns:a="http://schemas.openxmlformats.org/drawingml/2006/main">
+              <a:graphicData uri="http://schemas.openxmlformats.org/drawingml/2006/picture">
+                <pic:pic xmlns:pic="http://schemas.openxmlformats.org/drawingml/2006/picture">
+                  <pic:nvPicPr>
+                    <pic:cNvPr id="1208613396" name=""/>
+                    <pic:cNvPicPr/>
+                  </pic:nvPicPr>
+                  <pic:blipFill>
+                    <a:blip r:embed="rId9"/>
+                    <a:stretch>
+                      <a:fillRect/>
+                    </a:stretch>
+                  </pic:blipFill>
+                  <pic:spPr>
+                    <a:xfrm>
+                      <a:off x="0" y="0"/>
+                      <a:ext cx="2569778" cy="4333104"/>
+                    </a:xfrm>
+                    <a:prstGeom prst="rect">
+                      <a:avLst/>
+                    </a:prstGeom>
+                  </pic:spPr>
+                </pic:pic>
+              </a:graphicData>
+            </a:graphic>
+          </wp:inline>
+        </w:drawing>
+      </w:r>
+    </w:p>
+    <w:p>
+      <w:pPr>
         <w:rPr>
           <w:rFonts w:ascii="Times New Roman" w:hAnsi="Times New Roman" w:cs="Times New Roman"/>
           <w:lang w:val="sv-SE"/>
@@ -1377,7 +1469,7 @@
                     </pic:cNvPicPr>
                   </pic:nvPicPr>
                   <pic:blipFill>
-                    <a:blip r:embed="rId9" cstate="print">
+                    <a:blip r:embed="rId10" cstate="print">
                       <a:extLst>
                         <a:ext uri="{28A0092B-C50C-407E-A947-70E740481C1C}">
                           <a14:useLocalDpi xmlns:a14="http://schemas.microsoft.com/office/drawing/2010/main" val="0"/>
@@ -1533,7 +1625,7 @@
                     </pic:cNvPicPr>
                   </pic:nvPicPr>
                   <pic:blipFill>
-                    <a:blip r:embed="rId10" cstate="print">
+                    <a:blip r:embed="rId11" cstate="print">
                       <a:extLst>
                         <a:ext uri="{28A0092B-C50C-407E-A947-70E740481C1C}">
                           <a14:useLocalDpi xmlns:a14="http://schemas.microsoft.com/office/drawing/2010/main" val="0"/>
@@ -1663,7 +1755,7 @@
                     </pic:cNvPicPr>
                   </pic:nvPicPr>
                   <pic:blipFill>
-                    <a:blip r:embed="rId11" cstate="print">
+                    <a:blip r:embed="rId12" cstate="print">
                       <a:extLst>
                         <a:ext uri="{28A0092B-C50C-407E-A947-70E740481C1C}">
                           <a14:useLocalDpi xmlns:a14="http://schemas.microsoft.com/office/drawing/2010/main" val="0"/>
@@ -1743,74 +1835,6 @@
     <w:p>
       <w:pPr>
         <w:pStyle w:val="ListParagraph"/>
-        <w:ind w:left="1080"/>
-        <w:rPr>
-          <w:rFonts w:ascii="Times New Roman" w:hAnsi="Times New Roman" w:cs="Times New Roman"/>
-          <w:b/>
-          <w:bCs/>
-          <w:lang w:val="sv-SE"/>
-        </w:rPr>
-      </w:pPr>
-      <w:r>
-        <w:rPr>
-          <w:rFonts w:ascii="Times New Roman" w:hAnsi="Times New Roman" w:cs="Times New Roman"/>
-          <w:b/>
-          <w:bCs/>
-          <w:lang w:val="sv-SE"/>
-        </w:rPr>
-        <w:lastRenderedPageBreak/>
-        <w:t>Project Praktikum 5</w:t>
-      </w:r>
-    </w:p>
-    <w:p>
-      <w:pPr>
-        <w:pStyle w:val="ListParagraph"/>
-        <w:ind w:left="1080"/>
-        <w:rPr>
-          <w:rFonts w:ascii="Times New Roman" w:hAnsi="Times New Roman" w:cs="Times New Roman"/>
-          <w:b/>
-          <w:bCs/>
-          <w:lang w:val="sv-SE"/>
-        </w:rPr>
-      </w:pPr>
-    </w:p>
-    <w:p>
-      <w:pPr>
-        <w:pStyle w:val="ListParagraph"/>
-        <w:ind w:left="1080"/>
-        <w:rPr>
-          <w:rFonts w:ascii="Times New Roman" w:hAnsi="Times New Roman" w:cs="Times New Roman"/>
-          <w:lang w:val="sv-SE"/>
-        </w:rPr>
-      </w:pPr>
-      <w:r>
-        <w:rPr>
-          <w:rFonts w:ascii="Times New Roman" w:hAnsi="Times New Roman" w:cs="Times New Roman"/>
-          <w:lang w:val="sv-SE"/>
-        </w:rPr>
-        <w:t>Pada praktikum ini, terdapat pro</w:t>
-      </w:r>
-      <w:r>
-        <w:rPr>
-          <w:rFonts w:ascii="Times New Roman" w:hAnsi="Times New Roman" w:cs="Times New Roman"/>
-          <w:lang w:val="sv-SE"/>
-        </w:rPr>
-        <w:t>ject yang dimana membuat sebuah aplikasi sederhana yang menggabungkan materi dari modul 1 sampai 5.</w:t>
-      </w:r>
-    </w:p>
-    <w:p>
-      <w:pPr>
-        <w:pStyle w:val="ListParagraph"/>
-        <w:ind w:left="1080"/>
-        <w:rPr>
-          <w:rFonts w:ascii="Times New Roman" w:hAnsi="Times New Roman" w:cs="Times New Roman"/>
-          <w:lang w:val="sv-SE"/>
-        </w:rPr>
-      </w:pPr>
-    </w:p>
-    <w:p>
-      <w:pPr>
-        <w:pStyle w:val="ListParagraph"/>
         <w:numPr>
           <w:ilvl w:val="0"/>
           <w:numId w:val="2"/>
@@ -1825,6 +1849,367 @@
           <w:rFonts w:ascii="Times New Roman" w:hAnsi="Times New Roman" w:cs="Times New Roman"/>
           <w:lang w:val="sv-SE"/>
         </w:rPr>
+        <w:lastRenderedPageBreak/>
+        <w:t>Jika telah selesai, maka ak</w:t>
+      </w:r>
+      <w:r>
+        <w:rPr>
+          <w:rFonts w:ascii="Times New Roman" w:hAnsi="Times New Roman" w:cs="Times New Roman"/>
+          <w:lang w:val="sv-SE"/>
+        </w:rPr>
+        <w:t>an muncul output seperti ini</w:t>
+      </w:r>
+    </w:p>
+    <w:p>
+      <w:pPr>
+        <w:pStyle w:val="ListParagraph"/>
+        <w:ind w:left="1080"/>
+        <w:rPr>
+          <w:rFonts w:ascii="Times New Roman" w:hAnsi="Times New Roman" w:cs="Times New Roman"/>
+          <w:lang w:val="sv-SE"/>
+        </w:rPr>
+      </w:pPr>
+    </w:p>
+    <w:p>
+      <w:pPr>
+        <w:pStyle w:val="ListParagraph"/>
+        <w:ind w:left="1080"/>
+        <w:rPr>
+          <w:rFonts w:ascii="Times New Roman" w:hAnsi="Times New Roman" w:cs="Times New Roman"/>
+          <w:lang w:val="sv-SE"/>
+        </w:rPr>
+      </w:pPr>
+      <w:r>
+        <w:rPr>
+          <w:rFonts w:ascii="Times New Roman" w:hAnsi="Times New Roman" w:cs="Times New Roman"/>
+          <w:lang w:val="sv-SE"/>
+        </w:rPr>
+        <w:drawing>
+          <wp:inline distT="0" distB="0" distL="0" distR="0" wp14:anchorId="422745F1" wp14:editId="197F609E">
+            <wp:extent cx="2354448" cy="3970020"/>
+            <wp:effectExtent l="0" t="0" r="8255" b="0"/>
+            <wp:docPr id="2032318952" name="Picture 1"/>
+            <wp:cNvGraphicFramePr>
+              <a:graphicFrameLocks xmlns:a="http://schemas.openxmlformats.org/drawingml/2006/main" noChangeAspect="1"/>
+            </wp:cNvGraphicFramePr>
+            <a:graphic xmlns:a="http://schemas.openxmlformats.org/drawingml/2006/main">
+              <a:graphicData uri="http://schemas.openxmlformats.org/drawingml/2006/picture">
+                <pic:pic xmlns:pic="http://schemas.openxmlformats.org/drawingml/2006/picture">
+                  <pic:nvPicPr>
+                    <pic:cNvPr id="2032318952" name=""/>
+                    <pic:cNvPicPr/>
+                  </pic:nvPicPr>
+                  <pic:blipFill>
+                    <a:blip r:embed="rId13"/>
+                    <a:stretch>
+                      <a:fillRect/>
+                    </a:stretch>
+                  </pic:blipFill>
+                  <pic:spPr>
+                    <a:xfrm>
+                      <a:off x="0" y="0"/>
+                      <a:ext cx="2360488" cy="3980205"/>
+                    </a:xfrm>
+                    <a:prstGeom prst="rect">
+                      <a:avLst/>
+                    </a:prstGeom>
+                  </pic:spPr>
+                </pic:pic>
+              </a:graphicData>
+            </a:graphic>
+          </wp:inline>
+        </w:drawing>
+      </w:r>
+    </w:p>
+    <w:p>
+      <w:pPr>
+        <w:pStyle w:val="ListParagraph"/>
+        <w:ind w:left="1080"/>
+        <w:rPr>
+          <w:rFonts w:ascii="Times New Roman" w:hAnsi="Times New Roman" w:cs="Times New Roman"/>
+          <w:lang w:val="sv-SE"/>
+        </w:rPr>
+      </w:pPr>
+    </w:p>
+    <w:p>
+      <w:pPr>
+        <w:pStyle w:val="ListParagraph"/>
+        <w:ind w:left="1080"/>
+        <w:rPr>
+          <w:rFonts w:ascii="Times New Roman" w:hAnsi="Times New Roman" w:cs="Times New Roman"/>
+          <w:lang w:val="sv-SE"/>
+        </w:rPr>
+      </w:pPr>
+      <w:r>
+        <w:rPr>
+          <w:rFonts w:ascii="Times New Roman" w:hAnsi="Times New Roman" w:cs="Times New Roman"/>
+          <w:lang w:val="sv-SE"/>
+        </w:rPr>
+        <w:lastRenderedPageBreak/>
+        <w:drawing>
+          <wp:inline distT="0" distB="0" distL="0" distR="0" wp14:anchorId="223666D2" wp14:editId="6BA77338">
+            <wp:extent cx="2573474" cy="4358640"/>
+            <wp:effectExtent l="0" t="0" r="0" b="3810"/>
+            <wp:docPr id="1614726753" name="Picture 1"/>
+            <wp:cNvGraphicFramePr>
+              <a:graphicFrameLocks xmlns:a="http://schemas.openxmlformats.org/drawingml/2006/main" noChangeAspect="1"/>
+            </wp:cNvGraphicFramePr>
+            <a:graphic xmlns:a="http://schemas.openxmlformats.org/drawingml/2006/main">
+              <a:graphicData uri="http://schemas.openxmlformats.org/drawingml/2006/picture">
+                <pic:pic xmlns:pic="http://schemas.openxmlformats.org/drawingml/2006/picture">
+                  <pic:nvPicPr>
+                    <pic:cNvPr id="1614726753" name=""/>
+                    <pic:cNvPicPr/>
+                  </pic:nvPicPr>
+                  <pic:blipFill>
+                    <a:blip r:embed="rId14"/>
+                    <a:stretch>
+                      <a:fillRect/>
+                    </a:stretch>
+                  </pic:blipFill>
+                  <pic:spPr>
+                    <a:xfrm>
+                      <a:off x="0" y="0"/>
+                      <a:ext cx="2579791" cy="4369339"/>
+                    </a:xfrm>
+                    <a:prstGeom prst="rect">
+                      <a:avLst/>
+                    </a:prstGeom>
+                  </pic:spPr>
+                </pic:pic>
+              </a:graphicData>
+            </a:graphic>
+          </wp:inline>
+        </w:drawing>
+      </w:r>
+    </w:p>
+    <w:p>
+      <w:pPr>
+        <w:pStyle w:val="ListParagraph"/>
+        <w:ind w:left="1080"/>
+        <w:rPr>
+          <w:rFonts w:ascii="Times New Roman" w:hAnsi="Times New Roman" w:cs="Times New Roman"/>
+          <w:lang w:val="sv-SE"/>
+        </w:rPr>
+      </w:pPr>
+    </w:p>
+    <w:p>
+      <w:pPr>
+        <w:pStyle w:val="ListParagraph"/>
+        <w:ind w:left="1080"/>
+        <w:rPr>
+          <w:rFonts w:ascii="Times New Roman" w:hAnsi="Times New Roman" w:cs="Times New Roman"/>
+          <w:lang w:val="sv-SE"/>
+        </w:rPr>
+      </w:pPr>
+      <w:r>
+        <w:rPr>
+          <w:rFonts w:ascii="Times New Roman" w:hAnsi="Times New Roman" w:cs="Times New Roman"/>
+          <w:lang w:val="sv-SE"/>
+        </w:rPr>
+        <w:drawing>
+          <wp:inline distT="0" distB="0" distL="0" distR="0" wp14:anchorId="7AD61675" wp14:editId="6C127067">
+            <wp:extent cx="2150390" cy="3596640"/>
+            <wp:effectExtent l="0" t="0" r="2540" b="3810"/>
+            <wp:docPr id="1265565520" name="Picture 1"/>
+            <wp:cNvGraphicFramePr>
+              <a:graphicFrameLocks xmlns:a="http://schemas.openxmlformats.org/drawingml/2006/main" noChangeAspect="1"/>
+            </wp:cNvGraphicFramePr>
+            <a:graphic xmlns:a="http://schemas.openxmlformats.org/drawingml/2006/main">
+              <a:graphicData uri="http://schemas.openxmlformats.org/drawingml/2006/picture">
+                <pic:pic xmlns:pic="http://schemas.openxmlformats.org/drawingml/2006/picture">
+                  <pic:nvPicPr>
+                    <pic:cNvPr id="1265565520" name=""/>
+                    <pic:cNvPicPr/>
+                  </pic:nvPicPr>
+                  <pic:blipFill>
+                    <a:blip r:embed="rId15"/>
+                    <a:stretch>
+                      <a:fillRect/>
+                    </a:stretch>
+                  </pic:blipFill>
+                  <pic:spPr>
+                    <a:xfrm>
+                      <a:off x="0" y="0"/>
+                      <a:ext cx="2153230" cy="3601391"/>
+                    </a:xfrm>
+                    <a:prstGeom prst="rect">
+                      <a:avLst/>
+                    </a:prstGeom>
+                  </pic:spPr>
+                </pic:pic>
+              </a:graphicData>
+            </a:graphic>
+          </wp:inline>
+        </w:drawing>
+      </w:r>
+    </w:p>
+    <w:p>
+      <w:pPr>
+        <w:pStyle w:val="ListParagraph"/>
+        <w:ind w:left="1080"/>
+        <w:rPr>
+          <w:rFonts w:ascii="Times New Roman" w:hAnsi="Times New Roman" w:cs="Times New Roman"/>
+          <w:lang w:val="sv-SE"/>
+        </w:rPr>
+      </w:pPr>
+    </w:p>
+    <w:p>
+      <w:pPr>
+        <w:pStyle w:val="ListParagraph"/>
+        <w:ind w:left="1080"/>
+        <w:rPr>
+          <w:rFonts w:ascii="Times New Roman" w:hAnsi="Times New Roman" w:cs="Times New Roman"/>
+          <w:lang w:val="sv-SE"/>
+        </w:rPr>
+      </w:pPr>
+      <w:r>
+        <w:rPr>
+          <w:rFonts w:ascii="Times New Roman" w:hAnsi="Times New Roman" w:cs="Times New Roman"/>
+          <w:lang w:val="sv-SE"/>
+        </w:rPr>
+        <w:lastRenderedPageBreak/>
+        <w:drawing>
+          <wp:inline distT="0" distB="0" distL="0" distR="0" wp14:anchorId="286376E3" wp14:editId="0F330D5B">
+            <wp:extent cx="2142390" cy="3589020"/>
+            <wp:effectExtent l="0" t="0" r="0" b="0"/>
+            <wp:docPr id="1589048121" name="Picture 1"/>
+            <wp:cNvGraphicFramePr>
+              <a:graphicFrameLocks xmlns:a="http://schemas.openxmlformats.org/drawingml/2006/main" noChangeAspect="1"/>
+            </wp:cNvGraphicFramePr>
+            <a:graphic xmlns:a="http://schemas.openxmlformats.org/drawingml/2006/main">
+              <a:graphicData uri="http://schemas.openxmlformats.org/drawingml/2006/picture">
+                <pic:pic xmlns:pic="http://schemas.openxmlformats.org/drawingml/2006/picture">
+                  <pic:nvPicPr>
+                    <pic:cNvPr id="1589048121" name=""/>
+                    <pic:cNvPicPr/>
+                  </pic:nvPicPr>
+                  <pic:blipFill>
+                    <a:blip r:embed="rId16"/>
+                    <a:stretch>
+                      <a:fillRect/>
+                    </a:stretch>
+                  </pic:blipFill>
+                  <pic:spPr>
+                    <a:xfrm>
+                      <a:off x="0" y="0"/>
+                      <a:ext cx="2149020" cy="3600126"/>
+                    </a:xfrm>
+                    <a:prstGeom prst="rect">
+                      <a:avLst/>
+                    </a:prstGeom>
+                  </pic:spPr>
+                </pic:pic>
+              </a:graphicData>
+            </a:graphic>
+          </wp:inline>
+        </w:drawing>
+      </w:r>
+    </w:p>
+    <w:p>
+      <w:pPr>
+        <w:pStyle w:val="ListParagraph"/>
+        <w:ind w:left="1080"/>
+        <w:rPr>
+          <w:rFonts w:ascii="Times New Roman" w:hAnsi="Times New Roman" w:cs="Times New Roman"/>
+          <w:lang w:val="sv-SE"/>
+        </w:rPr>
+      </w:pPr>
+    </w:p>
+    <w:p>
+      <w:pPr>
+        <w:pStyle w:val="ListParagraph"/>
+        <w:ind w:left="1080"/>
+        <w:rPr>
+          <w:rFonts w:ascii="Times New Roman" w:hAnsi="Times New Roman" w:cs="Times New Roman"/>
+          <w:lang w:val="sv-SE"/>
+        </w:rPr>
+      </w:pPr>
+    </w:p>
+    <w:p>
+      <w:pPr>
+        <w:pStyle w:val="ListParagraph"/>
+        <w:ind w:left="1080"/>
+        <w:rPr>
+          <w:rFonts w:ascii="Times New Roman" w:hAnsi="Times New Roman" w:cs="Times New Roman"/>
+          <w:b/>
+          <w:bCs/>
+          <w:lang w:val="sv-SE"/>
+        </w:rPr>
+      </w:pPr>
+      <w:r>
+        <w:rPr>
+          <w:rFonts w:ascii="Times New Roman" w:hAnsi="Times New Roman" w:cs="Times New Roman"/>
+          <w:b/>
+          <w:bCs/>
+          <w:lang w:val="sv-SE"/>
+        </w:rPr>
+        <w:t>Project Praktikum 5</w:t>
+      </w:r>
+    </w:p>
+    <w:p>
+      <w:pPr>
+        <w:pStyle w:val="ListParagraph"/>
+        <w:ind w:left="1080"/>
+        <w:rPr>
+          <w:rFonts w:ascii="Times New Roman" w:hAnsi="Times New Roman" w:cs="Times New Roman"/>
+          <w:b/>
+          <w:bCs/>
+          <w:lang w:val="sv-SE"/>
+        </w:rPr>
+      </w:pPr>
+    </w:p>
+    <w:p>
+      <w:pPr>
+        <w:pStyle w:val="ListParagraph"/>
+        <w:ind w:left="1080"/>
+        <w:rPr>
+          <w:rFonts w:ascii="Times New Roman" w:hAnsi="Times New Roman" w:cs="Times New Roman"/>
+          <w:lang w:val="sv-SE"/>
+        </w:rPr>
+      </w:pPr>
+      <w:r>
+        <w:rPr>
+          <w:rFonts w:ascii="Times New Roman" w:hAnsi="Times New Roman" w:cs="Times New Roman"/>
+          <w:lang w:val="sv-SE"/>
+        </w:rPr>
+        <w:t>Pada praktikum ini, terdapat pro</w:t>
+      </w:r>
+      <w:r>
+        <w:rPr>
+          <w:rFonts w:ascii="Times New Roman" w:hAnsi="Times New Roman" w:cs="Times New Roman"/>
+          <w:lang w:val="sv-SE"/>
+        </w:rPr>
+        <w:t>ject yang dimana membuat sebuah aplikasi sederhana yang menggabungkan materi dari modul 1 sampai 5.</w:t>
+      </w:r>
+    </w:p>
+    <w:p>
+      <w:pPr>
+        <w:pStyle w:val="ListParagraph"/>
+        <w:ind w:left="1080"/>
+        <w:rPr>
+          <w:rFonts w:ascii="Times New Roman" w:hAnsi="Times New Roman" w:cs="Times New Roman"/>
+          <w:lang w:val="sv-SE"/>
+        </w:rPr>
+      </w:pPr>
+    </w:p>
+    <w:p>
+      <w:pPr>
+        <w:pStyle w:val="ListParagraph"/>
+        <w:numPr>
+          <w:ilvl w:val="0"/>
+          <w:numId w:val="2"/>
+        </w:numPr>
+        <w:rPr>
+          <w:rFonts w:ascii="Times New Roman" w:hAnsi="Times New Roman" w:cs="Times New Roman"/>
+          <w:lang w:val="sv-SE"/>
+        </w:rPr>
+      </w:pPr>
+      <w:r>
+        <w:rPr>
+          <w:rFonts w:ascii="Times New Roman" w:hAnsi="Times New Roman" w:cs="Times New Roman"/>
+          <w:lang w:val="sv-SE"/>
+        </w:rPr>
         <w:t>Persiapan Project Flutter</w:t>
       </w:r>
     </w:p>
@@ -2010,6 +2395,7 @@
           <w:noProof/>
           <w:lang w:val="sv-SE"/>
         </w:rPr>
+        <w:lastRenderedPageBreak/>
         <w:drawing>
           <wp:inline distT="0" distB="0" distL="0" distR="0" wp14:anchorId="4565EE40" wp14:editId="6F5661EB">
             <wp:extent cx="1386840" cy="2084412"/>
@@ -2026,7 +2412,7 @@
                     <pic:cNvPicPr/>
                   </pic:nvPicPr>
                   <pic:blipFill>
-                    <a:blip r:embed="rId12"/>
+                    <a:blip r:embed="rId17"/>
                     <a:stretch>
                       <a:fillRect/>
                     </a:stretch>
@@ -2143,7 +2529,7 @@
                     <pic:cNvPicPr/>
                   </pic:nvPicPr>
                   <pic:blipFill>
-                    <a:blip r:embed="rId13"/>
+                    <a:blip r:embed="rId18"/>
                     <a:stretch>
                       <a:fillRect/>
                     </a:stretch>
@@ -2225,74 +2611,67 @@
           <w:rFonts w:ascii="Times New Roman" w:hAnsi="Times New Roman" w:cs="Times New Roman"/>
           <w:lang w:val="sv-SE"/>
         </w:rPr>
-        <w:t xml:space="preserve">at file database_helper.dart untuk mengelola database lokal aplikasi. File ini berfungsi membuka database, membuat tabel, menyimpan data pengguna, mengambil data transaksi, memperbarui transaksi, menghapus transaksi, dan </w:t>
-      </w:r>
-      <w:r>
-        <w:rPr>
-          <w:rFonts w:ascii="Times New Roman" w:hAnsi="Times New Roman" w:cs="Times New Roman"/>
-          <w:lang w:val="sv-SE"/>
+        <w:t>at file database_helper.dart untuk mengelola database lokal aplikasi. File ini berfungsi membuka database, membuat tabel, menyimpan data pengguna, mengambil data transaksi, memperbarui transaksi, menghapus transaksi, dan menghitung total pengeluaran. Database yang digunakan bernama catatan_keuangan.db, dengan dua tabel utama, yaitu users dan transactions.</w:t>
+      </w:r>
+    </w:p>
+    <w:p>
+      <w:pPr>
+        <w:pStyle w:val="ListParagraph"/>
+        <w:ind w:left="1080"/>
+        <w:rPr>
+          <w:rFonts w:ascii="Times New Roman" w:hAnsi="Times New Roman" w:cs="Times New Roman"/>
+          <w:lang w:val="sv-SE"/>
+        </w:rPr>
+      </w:pPr>
+    </w:p>
+    <w:p>
+      <w:pPr>
+        <w:pStyle w:val="ListParagraph"/>
+        <w:ind w:left="1080"/>
+        <w:rPr>
+          <w:rFonts w:ascii="Times New Roman" w:hAnsi="Times New Roman" w:cs="Times New Roman"/>
+          <w:lang w:val="sv-SE"/>
+        </w:rPr>
+      </w:pPr>
+      <w:r>
+        <w:rPr>
+          <w:rFonts w:ascii="Times New Roman" w:hAnsi="Times New Roman" w:cs="Times New Roman"/>
+          <w:lang w:val="sv-SE"/>
+        </w:rPr>
+        <w:t>Kode berikut merupakan bagian utama untuk membuka database dan membuat tabel</w:t>
+      </w:r>
+      <w:r>
+        <w:rPr>
+          <w:rFonts w:ascii="Times New Roman" w:hAnsi="Times New Roman" w:cs="Times New Roman"/>
+          <w:lang w:val="sv-SE"/>
+        </w:rPr>
+        <w:t>:</w:t>
+      </w:r>
+    </w:p>
+    <w:p>
+      <w:pPr>
+        <w:pStyle w:val="ListParagraph"/>
+        <w:ind w:left="1080"/>
+        <w:rPr>
+          <w:rFonts w:ascii="Times New Roman" w:hAnsi="Times New Roman" w:cs="Times New Roman"/>
+          <w:lang w:val="sv-SE"/>
+        </w:rPr>
+      </w:pPr>
+    </w:p>
+    <w:p>
+      <w:pPr>
+        <w:pStyle w:val="ListParagraph"/>
+        <w:ind w:left="1080"/>
+        <w:rPr>
+          <w:rFonts w:ascii="Times New Roman" w:hAnsi="Times New Roman" w:cs="Times New Roman"/>
+        </w:rPr>
+      </w:pPr>
+      <w:r>
+        <w:rPr>
+          <w:rFonts w:ascii="Times New Roman" w:hAnsi="Times New Roman" w:cs="Times New Roman"/>
+          <w:noProof/>
         </w:rPr>
         <w:lastRenderedPageBreak/>
-        <w:t>menghitung total pengeluaran. Database yang digunakan bernama catatan_keuangan.db, dengan dua tabel utama, yaitu users dan transactions.</w:t>
-      </w:r>
-    </w:p>
-    <w:p>
-      <w:pPr>
-        <w:pStyle w:val="ListParagraph"/>
-        <w:ind w:left="1080"/>
-        <w:rPr>
-          <w:rFonts w:ascii="Times New Roman" w:hAnsi="Times New Roman" w:cs="Times New Roman"/>
-          <w:lang w:val="sv-SE"/>
-        </w:rPr>
-      </w:pPr>
-    </w:p>
-    <w:p>
-      <w:pPr>
-        <w:pStyle w:val="ListParagraph"/>
-        <w:ind w:left="1080"/>
-        <w:rPr>
-          <w:rFonts w:ascii="Times New Roman" w:hAnsi="Times New Roman" w:cs="Times New Roman"/>
-          <w:lang w:val="sv-SE"/>
-        </w:rPr>
-      </w:pPr>
-      <w:r>
-        <w:rPr>
-          <w:rFonts w:ascii="Times New Roman" w:hAnsi="Times New Roman" w:cs="Times New Roman"/>
-          <w:lang w:val="sv-SE"/>
-        </w:rPr>
-        <w:t>Kode berikut merupakan bagian utama untuk membuka database dan membuat tabel</w:t>
-      </w:r>
-      <w:r>
-        <w:rPr>
-          <w:rFonts w:ascii="Times New Roman" w:hAnsi="Times New Roman" w:cs="Times New Roman"/>
-          <w:lang w:val="sv-SE"/>
-        </w:rPr>
-        <w:t>:</w:t>
-      </w:r>
-    </w:p>
-    <w:p>
-      <w:pPr>
-        <w:pStyle w:val="ListParagraph"/>
-        <w:ind w:left="1080"/>
-        <w:rPr>
-          <w:rFonts w:ascii="Times New Roman" w:hAnsi="Times New Roman" w:cs="Times New Roman"/>
-          <w:lang w:val="sv-SE"/>
-        </w:rPr>
-      </w:pPr>
-    </w:p>
-    <w:p>
-      <w:pPr>
-        <w:pStyle w:val="ListParagraph"/>
-        <w:ind w:left="1080"/>
-        <w:rPr>
-          <w:rFonts w:ascii="Times New Roman" w:hAnsi="Times New Roman" w:cs="Times New Roman"/>
-        </w:rPr>
-      </w:pPr>
-      <w:r>
-        <w:rPr>
-          <w:rFonts w:ascii="Times New Roman" w:hAnsi="Times New Roman" w:cs="Times New Roman"/>
-          <w:noProof/>
-        </w:rPr>
         <w:drawing>
           <wp:inline distT="0" distB="0" distL="0" distR="0" wp14:anchorId="7E5C6440" wp14:editId="69A9957E">
             <wp:extent cx="3506204" cy="7010400"/>
@@ -2311,7 +2690,7 @@
                     </pic:cNvPicPr>
                   </pic:nvPicPr>
                   <pic:blipFill>
-                    <a:blip r:embed="rId14" cstate="print">
+                    <a:blip r:embed="rId19" cstate="print">
                       <a:extLst>
                         <a:ext uri="{28A0092B-C50C-407E-A947-70E740481C1C}">
                           <a14:useLocalDpi xmlns:a14="http://schemas.microsoft.com/office/drawing/2010/main" val="0"/>
@@ -2364,14 +2743,7 @@
         <w:rPr>
           <w:rFonts w:ascii="Times New Roman" w:hAnsi="Times New Roman" w:cs="Times New Roman"/>
         </w:rPr>
-        <w:t xml:space="preserve">Tabel users digunakan untuk menyimpan identitas pengguna, seperti nama, email, dan hash password. Sementara itu, tabel transactions digunakan untuk menyimpan </w:t>
-      </w:r>
-      <w:r>
-        <w:rPr>
-          <w:rFonts w:ascii="Times New Roman" w:hAnsi="Times New Roman" w:cs="Times New Roman"/>
-        </w:rPr>
-        <w:lastRenderedPageBreak/>
-        <w:t xml:space="preserve">data transaksi berupa judul, nominal, kategori, tanggal, dan ID pengguna yang melakukan transaksi. </w:t>
+        <w:t xml:space="preserve">Tabel users digunakan untuk menyimpan identitas pengguna, seperti nama, email, dan hash password. Sementara itu, tabel transactions digunakan untuk menyimpan data transaksi berupa judul, nominal, kategori, tanggal, dan ID pengguna yang melakukan transaksi. </w:t>
       </w:r>
       <w:r>
         <w:rPr>
@@ -2411,6 +2783,7 @@
         <w:rPr>
           <w:rFonts w:ascii="Times New Roman" w:hAnsi="Times New Roman" w:cs="Times New Roman"/>
         </w:rPr>
+        <w:lastRenderedPageBreak/>
         <w:t>Menambahkan Fungsi Pengelolaan Database</w:t>
       </w:r>
     </w:p>
@@ -2512,7 +2885,7 @@
                     </pic:cNvPicPr>
                   </pic:nvPicPr>
                   <pic:blipFill>
-                    <a:blip r:embed="rId15" cstate="print">
+                    <a:blip r:embed="rId20" cstate="print">
                       <a:extLst>
                         <a:ext uri="{28A0092B-C50C-407E-A947-70E740481C1C}">
                           <a14:useLocalDpi xmlns:a14="http://schemas.microsoft.com/office/drawing/2010/main" val="0"/>
@@ -2619,7 +2992,7 @@
                     </pic:cNvPicPr>
                   </pic:nvPicPr>
                   <pic:blipFill>
-                    <a:blip r:embed="rId16" cstate="print">
+                    <a:blip r:embed="rId21" cstate="print">
                       <a:extLst>
                         <a:ext uri="{28A0092B-C50C-407E-A947-70E740481C1C}">
                           <a14:useLocalDpi xmlns:a14="http://schemas.microsoft.com/office/drawing/2010/main" val="0"/>
@@ -2727,7 +3100,7 @@
                     </pic:cNvPicPr>
                   </pic:nvPicPr>
                   <pic:blipFill>
-                    <a:blip r:embed="rId17" cstate="print">
+                    <a:blip r:embed="rId22" cstate="print">
                       <a:extLst>
                         <a:ext uri="{28A0092B-C50C-407E-A947-70E740481C1C}">
                           <a14:useLocalDpi xmlns:a14="http://schemas.microsoft.com/office/drawing/2010/main" val="0"/>
@@ -2878,7 +3251,7 @@
                     </pic:cNvPicPr>
                   </pic:nvPicPr>
                   <pic:blipFill>
-                    <a:blip r:embed="rId18" cstate="print">
+                    <a:blip r:embed="rId23" cstate="print">
                       <a:extLst>
                         <a:ext uri="{28A0092B-C50C-407E-A947-70E740481C1C}">
                           <a14:useLocalDpi xmlns:a14="http://schemas.microsoft.com/office/drawing/2010/main" val="0"/>
@@ -3108,7 +3481,7 @@
                     </pic:cNvPicPr>
                   </pic:nvPicPr>
                   <pic:blipFill>
-                    <a:blip r:embed="rId19" cstate="print">
+                    <a:blip r:embed="rId24" cstate="print">
                       <a:extLst>
                         <a:ext uri="{28A0092B-C50C-407E-A947-70E740481C1C}">
                           <a14:useLocalDpi xmlns:a14="http://schemas.microsoft.com/office/drawing/2010/main" val="0"/>
@@ -3324,7 +3697,7 @@
                     </pic:cNvPicPr>
                   </pic:nvPicPr>
                   <pic:blipFill>
-                    <a:blip r:embed="rId20" cstate="print">
+                    <a:blip r:embed="rId25" cstate="print">
                       <a:extLst>
                         <a:ext uri="{28A0092B-C50C-407E-A947-70E740481C1C}">
                           <a14:useLocalDpi xmlns:a14="http://schemas.microsoft.com/office/drawing/2010/main" val="0"/>
@@ -3489,7 +3862,7 @@
                     </pic:cNvPicPr>
                   </pic:nvPicPr>
                   <pic:blipFill>
-                    <a:blip r:embed="rId21" cstate="print">
+                    <a:blip r:embed="rId26" cstate="print">
                       <a:extLst>
                         <a:ext uri="{28A0092B-C50C-407E-A947-70E740481C1C}">
                           <a14:useLocalDpi xmlns:a14="http://schemas.microsoft.com/office/drawing/2010/main" val="0"/>
@@ -3716,7 +4089,7 @@
                     </pic:cNvPicPr>
                   </pic:nvPicPr>
                   <pic:blipFill>
-                    <a:blip r:embed="rId22" cstate="print">
+                    <a:blip r:embed="rId27" cstate="print">
                       <a:extLst>
                         <a:ext uri="{28A0092B-C50C-407E-A947-70E740481C1C}">
                           <a14:useLocalDpi xmlns:a14="http://schemas.microsoft.com/office/drawing/2010/main" val="0"/>
@@ -3975,7 +4348,7 @@
                     <pic:cNvPicPr/>
                   </pic:nvPicPr>
                   <pic:blipFill>
-                    <a:blip r:embed="rId23"/>
+                    <a:blip r:embed="rId28"/>
                     <a:stretch>
                       <a:fillRect/>
                     </a:stretch>
@@ -4028,7 +4401,7 @@
                     <pic:cNvPicPr/>
                   </pic:nvPicPr>
                   <pic:blipFill>
-                    <a:blip r:embed="rId24"/>
+                    <a:blip r:embed="rId29"/>
                     <a:stretch>
                       <a:fillRect/>
                     </a:stretch>
@@ -4080,7 +4453,7 @@
                     <pic:cNvPicPr/>
                   </pic:nvPicPr>
                   <pic:blipFill>
-                    <a:blip r:embed="rId25"/>
+                    <a:blip r:embed="rId30"/>
                     <a:stretch>
                       <a:fillRect/>
                     </a:stretch>
@@ -4262,7 +4635,7 @@
                     </pic:cNvPicPr>
                   </pic:nvPicPr>
                   <pic:blipFill>
-                    <a:blip r:embed="rId26" cstate="print">
+                    <a:blip r:embed="rId31" cstate="print">
                       <a:extLst>
                         <a:ext uri="{28A0092B-C50C-407E-A947-70E740481C1C}">
                           <a14:useLocalDpi xmlns:a14="http://schemas.microsoft.com/office/drawing/2010/main" val="0"/>
@@ -4474,7 +4847,7 @@
                     </pic:cNvPicPr>
                   </pic:nvPicPr>
                   <pic:blipFill>
-                    <a:blip r:embed="rId27" cstate="print">
+                    <a:blip r:embed="rId32" cstate="print">
                       <a:extLst>
                         <a:ext uri="{28A0092B-C50C-407E-A947-70E740481C1C}">
                           <a14:useLocalDpi xmlns:a14="http://schemas.microsoft.com/office/drawing/2010/main" val="0"/>
@@ -4646,7 +5019,7 @@
                     </pic:cNvPicPr>
                   </pic:nvPicPr>
                   <pic:blipFill>
-                    <a:blip r:embed="rId28" cstate="print">
+                    <a:blip r:embed="rId33" cstate="print">
                       <a:extLst>
                         <a:ext uri="{28A0092B-C50C-407E-A947-70E740481C1C}">
                           <a14:useLocalDpi xmlns:a14="http://schemas.microsoft.com/office/drawing/2010/main" val="0"/>
@@ -4865,7 +5238,7 @@
                     </pic:cNvPicPr>
                   </pic:nvPicPr>
                   <pic:blipFill>
-                    <a:blip r:embed="rId29" cstate="print">
+                    <a:blip r:embed="rId34" cstate="print">
                       <a:extLst>
                         <a:ext uri="{28A0092B-C50C-407E-A947-70E740481C1C}">
                           <a14:useLocalDpi xmlns:a14="http://schemas.microsoft.com/office/drawing/2010/main" val="0"/>
@@ -5066,7 +5439,7 @@
                     </pic:cNvPicPr>
                   </pic:nvPicPr>
                   <pic:blipFill>
-                    <a:blip r:embed="rId30" cstate="print">
+                    <a:blip r:embed="rId35" cstate="print">
                       <a:extLst>
                         <a:ext uri="{28A0092B-C50C-407E-A947-70E740481C1C}">
                           <a14:useLocalDpi xmlns:a14="http://schemas.microsoft.com/office/drawing/2010/main" val="0"/>
@@ -5291,7 +5664,7 @@
                     <pic:cNvPicPr/>
                   </pic:nvPicPr>
                   <pic:blipFill>
-                    <a:blip r:embed="rId31"/>
+                    <a:blip r:embed="rId36"/>
                     <a:stretch>
                       <a:fillRect/>
                     </a:stretch>
@@ -5410,7 +5783,7 @@
                     <pic:cNvPicPr/>
                   </pic:nvPicPr>
                   <pic:blipFill>
-                    <a:blip r:embed="rId32"/>
+                    <a:blip r:embed="rId37"/>
                     <a:stretch>
                       <a:fillRect/>
                     </a:stretch>
@@ -5463,7 +5836,7 @@
                     <pic:cNvPicPr/>
                   </pic:nvPicPr>
                   <pic:blipFill>
-                    <a:blip r:embed="rId33"/>
+                    <a:blip r:embed="rId38"/>
                     <a:stretch>
                       <a:fillRect/>
                     </a:stretch>
@@ -5516,7 +5889,7 @@
                     <pic:cNvPicPr/>
                   </pic:nvPicPr>
                   <pic:blipFill>
-                    <a:blip r:embed="rId34"/>
+                    <a:blip r:embed="rId39"/>
                     <a:stretch>
                       <a:fillRect/>
                     </a:stretch>
@@ -5569,7 +5942,7 @@
                     <pic:cNvPicPr/>
                   </pic:nvPicPr>
                   <pic:blipFill>
-                    <a:blip r:embed="rId35"/>
+                    <a:blip r:embed="rId40"/>
                     <a:stretch>
                       <a:fillRect/>
                     </a:stretch>
@@ -5621,7 +5994,7 @@
                     <pic:cNvPicPr/>
                   </pic:nvPicPr>
                   <pic:blipFill>
-                    <a:blip r:embed="rId36"/>
+                    <a:blip r:embed="rId41"/>
                     <a:stretch>
                       <a:fillRect/>
                     </a:stretch>
@@ -5674,7 +6047,7 @@
                     <pic:cNvPicPr/>
                   </pic:nvPicPr>
                   <pic:blipFill>
-                    <a:blip r:embed="rId37"/>
+                    <a:blip r:embed="rId42"/>
                     <a:stretch>
                       <a:fillRect/>
                     </a:stretch>
@@ -5727,7 +6100,7 @@
                     <pic:cNvPicPr/>
                   </pic:nvPicPr>
                   <pic:blipFill>
-                    <a:blip r:embed="rId38"/>
+                    <a:blip r:embed="rId43"/>
                     <a:stretch>
                       <a:fillRect/>
                     </a:stretch>
@@ -5780,7 +6153,7 @@
                     <pic:cNvPicPr/>
                   </pic:nvPicPr>
                   <pic:blipFill>
-                    <a:blip r:embed="rId39"/>
+                    <a:blip r:embed="rId44"/>
                     <a:stretch>
                       <a:fillRect/>
                     </a:stretch>
@@ -5832,7 +6205,7 @@
                     <pic:cNvPicPr/>
                   </pic:nvPicPr>
                   <pic:blipFill>
-                    <a:blip r:embed="rId40"/>
+                    <a:blip r:embed="rId45"/>
                     <a:stretch>
                       <a:fillRect/>
                     </a:stretch>
@@ -5885,7 +6258,7 @@
                     <pic:cNvPicPr/>
                   </pic:nvPicPr>
                   <pic:blipFill>
-                    <a:blip r:embed="rId41"/>
+                    <a:blip r:embed="rId46"/>
                     <a:stretch>
                       <a:fillRect/>
                     </a:stretch>

</xml_diff>